<commit_message>
fix: connect About action to dialog
</commit_message>
<xml_diff>
--- a/experiment2_text_editor/docs/实验2-简单文本编辑器-完成版.docx
+++ b/experiment2_text_editor/docs/实验2-简单文本编辑器-完成版.docx
@@ -3693,13 +3693,15 @@
                 <w:rFonts w:ascii="Consolas" w:hAnsi="Consolas" w:eastAsia="宋体"/>
                 <w:sz w:val="18"/>
               </w:rPr>
-              <w:t>1bf324e docs: fill official experiment report template</w:t>
+              <w:t>1977b4b style: refresh editor identity and Journey demo screenshots</w:t>
               <w:br/>
-              <w:t>27177eb test: verify unsaved close prompt and cancel behavior</w:t>
+              <w:t>af3064b docs: fill official experiment report template</w:t>
               <w:br/>
-              <w:t>e50c032 docs: add experiment notes and runtime screenshots</w:t>
+              <w:t>815188c test: verify unsaved close prompt and cancel behavior</w:t>
               <w:br/>
-              <w:t>5e7e4d9 feat: add simple text editor with complete editing workflow</w:t>
+              <w:t>80b78c3 docs: add experiment notes and runtime screenshots</w:t>
+              <w:br/>
+              <w:t>abc7e29 feat: add simple text editor with complete editing workflow</w:t>
             </w:r>
           </w:p>
           <w:p>
@@ -3790,7 +3792,7 @@
                 <w:rFonts w:ascii="宋体" w:hAnsi="宋体" w:eastAsia="宋体"/>
                 <w:sz w:val="24"/>
               </w:rPr>
-              <w:t>执行 ctest --test-dir build --output-on-failure，构建目录 1/1 测试通过，退出码为 0。QtTest 中共有 7 个功能测试，覆盖 UTF-8 保存/重开、缺失文件、二进制文件、连续与环绕查找、大小写不敏感全部替换、行号显隐、动作状态以及未保存关闭提示。</w:t>
+              <w:t>执行 ctest --test-dir build --output-on-failure，构建目录 1/1 测试通过，退出码为 0。QtTest 中共有 8 个功能测试，覆盖 UTF-8 保存/重开、缺失文件、二进制文件、连续与环绕查找、大小写不敏感全部替换、行号显隐、动作状态、未保存关闭提示以及关于菜单触发。</w:t>
             </w:r>
           </w:p>
           <w:p>

</xml_diff>